<commit_message>
Use Superman as the CV name
Co-Authored-By: Claude Opus 5.5 <noreply@anthropic.com>
Claude-Session: https://claude.ai/code/session_01FBuHsgfNN7NePtiYw7LpVx
</commit_message>
<xml_diff>
--- a/Superman_CV.docx
+++ b/Superman_CV.docx
@@ -16,7 +16,7 @@
           <w:sz w:val="48"/>
           <w:szCs w:val="48"/>
         </w:rPr>
-        <w:t xml:space="preserve">Clark Kent (Superman)</w:t>
+        <w:t xml:space="preserve">Superman</w:t>
       </w:r>
     </w:p>
     <w:p>
@@ -48,7 +48,7 @@
           <w:sz w:val="19"/>
           <w:szCs w:val="19"/>
         </w:rPr>
-        <w:t xml:space="preserve">Metropolis, USA   |   clark.kent@dailyplanet.com   |   +1 (555) 013-8000   |   linkedin.com/in/clarkkent</w:t>
+        <w:t xml:space="preserve">Metropolis, USA   |   superman@dailyplanet.com   |   +1 (555) 013-8000   |   linkedin.com/in/superman</w:t>
       </w:r>
     </w:p>
     <w:p>

</xml_diff>

<commit_message>
Simplify company and university names in Superman CV
Also tighten spacing so it stays on one page in any viewer.

Co-Authored-By: Claude Opus 5.5 <noreply@anthropic.com>
Claude-Session: https://claude.ai/code/session_01FBuHsgfNN7NePtiYw7LpVx
</commit_message>
<xml_diff>
--- a/Superman_CV.docx
+++ b/Superman_CV.docx
@@ -48,7 +48,7 @@
           <w:sz w:val="19"/>
           <w:szCs w:val="19"/>
         </w:rPr>
-        <w:t xml:space="preserve">Metropolis, USA   |   superman@dailyplanet.com   |   +1 (555) 013-8000   |   linkedin.com/in/superman</w:t>
+        <w:t xml:space="preserve">Metropolis, USA   |   superman@citynews.com   |   +1 (555) 013-8000   |   linkedin.com/in/superman</w:t>
       </w:r>
     </w:p>
     <w:p>
@@ -56,7 +56,7 @@
         <w:pBdr>
           <w:bottom w:val="single" w:color="111111" w:sz="12" w:space="2"/>
         </w:pBdr>
-        <w:spacing w:after="100" w:before="220"/>
+        <w:spacing w:after="80" w:before="180"/>
       </w:pPr>
       <w:r>
         <w:rPr>
@@ -79,8 +79,8 @@
         <w:rPr>
           <w:rFonts w:ascii="Cambria" w:cs="Cambria" w:eastAsia="Cambria" w:hAnsi="Cambria"/>
           <w:color w:val="111111"/>
-          <w:sz w:val="21"/>
-          <w:szCs w:val="21"/>
+          <w:sz w:val="20"/>
+          <w:szCs w:val="20"/>
         </w:rPr>
         <w:t xml:space="preserve">Crisis response specialist with 85+ years of experience protecting people and cities around the world. Rescued more than 1,000,000 people with a 99% mission success rate. Skilled in emergency response, team leadership and fast decision-making under pressure. Known for complete honesty, strong teamwork and never missing a deadline. Available 24/7 and ready to start immediately.</w:t>
       </w:r>
@@ -90,7 +90,7 @@
         <w:pBdr>
           <w:bottom w:val="single" w:color="111111" w:sz="12" w:space="2"/>
         </w:pBdr>
-        <w:spacing w:after="100" w:before="220"/>
+        <w:spacing w:after="80" w:before="180"/>
       </w:pPr>
       <w:r>
         <w:rPr>
@@ -118,8 +118,8 @@
           <w:b/>
           <w:bCs/>
           <w:color w:val="111111"/>
-          <w:sz w:val="21"/>
-          <w:szCs w:val="21"/>
+          <w:sz w:val="20"/>
+          <w:szCs w:val="20"/>
         </w:rPr>
         <w:t xml:space="preserve">Global Protection Specialist</w:t>
       </w:r>
@@ -127,8 +127,8 @@
         <w:rPr>
           <w:rFonts w:ascii="Cambria" w:cs="Cambria" w:eastAsia="Cambria" w:hAnsi="Cambria"/>
           <w:color w:val="111111"/>
-          <w:sz w:val="21"/>
-          <w:szCs w:val="21"/>
+          <w:sz w:val="20"/>
+          <w:szCs w:val="20"/>
         </w:rPr>
         <w:t xml:space="preserve">	1938/06 – Present</w:t>
       </w:r>
@@ -146,17 +146,17 @@
           <w:i/>
           <w:iCs/>
           <w:color w:val="333333"/>
-          <w:sz w:val="21"/>
-          <w:szCs w:val="21"/>
-        </w:rPr>
-        <w:t xml:space="preserve">Self-employed</w:t>
-      </w:r>
-      <w:r>
-        <w:rPr>
-          <w:rFonts w:ascii="Cambria" w:cs="Cambria" w:eastAsia="Cambria" w:hAnsi="Cambria"/>
-          <w:color w:val="111111"/>
-          <w:sz w:val="21"/>
-          <w:szCs w:val="21"/>
+          <w:sz w:val="20"/>
+          <w:szCs w:val="20"/>
+        </w:rPr>
+        <w:t xml:space="preserve">Freelance</w:t>
+      </w:r>
+      <w:r>
+        <w:rPr>
+          <w:rFonts w:ascii="Cambria" w:cs="Cambria" w:eastAsia="Cambria" w:hAnsi="Cambria"/>
+          <w:color w:val="111111"/>
+          <w:sz w:val="20"/>
+          <w:szCs w:val="20"/>
         </w:rPr>
         <w:t xml:space="preserve">	Metropolis, USA</w:t>
       </w:r>
@@ -174,8 +174,8 @@
         <w:rPr>
           <w:rFonts w:ascii="Cambria" w:cs="Cambria" w:eastAsia="Cambria" w:hAnsi="Cambria"/>
           <w:color w:val="111111"/>
-          <w:sz w:val="21"/>
-          <w:szCs w:val="21"/>
+          <w:sz w:val="20"/>
+          <w:szCs w:val="20"/>
         </w:rPr>
         <w:t xml:space="preserve">Rescued 1,000,000+ people from natural disasters, accidents and attacks.</w:t>
       </w:r>
@@ -193,8 +193,8 @@
         <w:rPr>
           <w:rFonts w:ascii="Cambria" w:cs="Cambria" w:eastAsia="Cambria" w:hAnsi="Cambria"/>
           <w:color w:val="111111"/>
-          <w:sz w:val="21"/>
-          <w:szCs w:val="21"/>
+          <w:sz w:val="20"/>
+          <w:szCs w:val="20"/>
         </w:rPr>
         <w:t xml:space="preserve">Stopped 500+ high-risk threats, including Lex Luthor and General Zod.</w:t>
       </w:r>
@@ -212,8 +212,8 @@
         <w:rPr>
           <w:rFonts w:ascii="Cambria" w:cs="Cambria" w:eastAsia="Cambria" w:hAnsi="Cambria"/>
           <w:color w:val="111111"/>
-          <w:sz w:val="21"/>
-          <w:szCs w:val="21"/>
+          <w:sz w:val="20"/>
+          <w:szCs w:val="20"/>
         </w:rPr>
         <w:t xml:space="preserve">Reduced emergency response time to under 10 seconds.</w:t>
       </w:r>
@@ -231,8 +231,8 @@
           <w:b/>
           <w:bCs/>
           <w:color w:val="111111"/>
-          <w:sz w:val="21"/>
-          <w:szCs w:val="21"/>
+          <w:sz w:val="20"/>
+          <w:szCs w:val="20"/>
         </w:rPr>
         <w:t xml:space="preserve">Founding Member and Team Leader</w:t>
       </w:r>
@@ -240,8 +240,8 @@
         <w:rPr>
           <w:rFonts w:ascii="Cambria" w:cs="Cambria" w:eastAsia="Cambria" w:hAnsi="Cambria"/>
           <w:color w:val="111111"/>
-          <w:sz w:val="21"/>
-          <w:szCs w:val="21"/>
+          <w:sz w:val="20"/>
+          <w:szCs w:val="20"/>
         </w:rPr>
         <w:t xml:space="preserve">	1960/11 – Present</w:t>
       </w:r>
@@ -259,17 +259,17 @@
           <w:i/>
           <w:iCs/>
           <w:color w:val="333333"/>
-          <w:sz w:val="21"/>
-          <w:szCs w:val="21"/>
-        </w:rPr>
-        <w:t xml:space="preserve">Justice League</w:t>
-      </w:r>
-      <w:r>
-        <w:rPr>
-          <w:rFonts w:ascii="Cambria" w:cs="Cambria" w:eastAsia="Cambria" w:hAnsi="Cambria"/>
-          <w:color w:val="111111"/>
-          <w:sz w:val="21"/>
-          <w:szCs w:val="21"/>
+          <w:sz w:val="20"/>
+          <w:szCs w:val="20"/>
+        </w:rPr>
+        <w:t xml:space="preserve">Hero Team</w:t>
+      </w:r>
+      <w:r>
+        <w:rPr>
+          <w:rFonts w:ascii="Cambria" w:cs="Cambria" w:eastAsia="Cambria" w:hAnsi="Cambria"/>
+          <w:color w:val="111111"/>
+          <w:sz w:val="20"/>
+          <w:szCs w:val="20"/>
         </w:rPr>
         <w:t xml:space="preserve">	Worldwide</w:t>
       </w:r>
@@ -287,8 +287,8 @@
         <w:rPr>
           <w:rFonts w:ascii="Cambria" w:cs="Cambria" w:eastAsia="Cambria" w:hAnsi="Cambria"/>
           <w:color w:val="111111"/>
-          <w:sz w:val="21"/>
-          <w:szCs w:val="21"/>
+          <w:sz w:val="20"/>
+          <w:szCs w:val="20"/>
         </w:rPr>
         <w:t xml:space="preserve">Co-founded a 7-member international team with Batman and Wonder Woman.</w:t>
       </w:r>
@@ -306,8 +306,8 @@
         <w:rPr>
           <w:rFonts w:ascii="Cambria" w:cs="Cambria" w:eastAsia="Cambria" w:hAnsi="Cambria"/>
           <w:color w:val="111111"/>
-          <w:sz w:val="21"/>
-          <w:szCs w:val="21"/>
+          <w:sz w:val="20"/>
+          <w:szCs w:val="20"/>
         </w:rPr>
         <w:t xml:space="preserve">Led high-risk missions with a 99% success rate.</w:t>
       </w:r>
@@ -325,8 +325,8 @@
         <w:rPr>
           <w:rFonts w:ascii="Cambria" w:cs="Cambria" w:eastAsia="Cambria" w:hAnsi="Cambria"/>
           <w:color w:val="111111"/>
-          <w:sz w:val="21"/>
-          <w:szCs w:val="21"/>
+          <w:sz w:val="20"/>
+          <w:szCs w:val="20"/>
         </w:rPr>
         <w:t xml:space="preserve">Coordinated with governments during 100+ global emergencies.</w:t>
       </w:r>
@@ -344,8 +344,8 @@
           <w:b/>
           <w:bCs/>
           <w:color w:val="111111"/>
-          <w:sz w:val="21"/>
-          <w:szCs w:val="21"/>
+          <w:sz w:val="20"/>
+          <w:szCs w:val="20"/>
         </w:rPr>
         <w:t xml:space="preserve">Investigative Reporter</w:t>
       </w:r>
@@ -353,8 +353,8 @@
         <w:rPr>
           <w:rFonts w:ascii="Cambria" w:cs="Cambria" w:eastAsia="Cambria" w:hAnsi="Cambria"/>
           <w:color w:val="111111"/>
-          <w:sz w:val="21"/>
-          <w:szCs w:val="21"/>
+          <w:sz w:val="20"/>
+          <w:szCs w:val="20"/>
         </w:rPr>
         <w:t xml:space="preserve">	1938/06 – Present</w:t>
       </w:r>
@@ -372,17 +372,17 @@
           <w:i/>
           <w:iCs/>
           <w:color w:val="333333"/>
-          <w:sz w:val="21"/>
-          <w:szCs w:val="21"/>
-        </w:rPr>
-        <w:t xml:space="preserve">The Daily Planet</w:t>
-      </w:r>
-      <w:r>
-        <w:rPr>
-          <w:rFonts w:ascii="Cambria" w:cs="Cambria" w:eastAsia="Cambria" w:hAnsi="Cambria"/>
-          <w:color w:val="111111"/>
-          <w:sz w:val="21"/>
-          <w:szCs w:val="21"/>
+          <w:sz w:val="20"/>
+          <w:szCs w:val="20"/>
+        </w:rPr>
+        <w:t xml:space="preserve">City News</w:t>
+      </w:r>
+      <w:r>
+        <w:rPr>
+          <w:rFonts w:ascii="Cambria" w:cs="Cambria" w:eastAsia="Cambria" w:hAnsi="Cambria"/>
+          <w:color w:val="111111"/>
+          <w:sz w:val="20"/>
+          <w:szCs w:val="20"/>
         </w:rPr>
         <w:t xml:space="preserve">	Metropolis, USA</w:t>
       </w:r>
@@ -400,8 +400,8 @@
         <w:rPr>
           <w:rFonts w:ascii="Cambria" w:cs="Cambria" w:eastAsia="Cambria" w:hAnsi="Cambria"/>
           <w:color w:val="111111"/>
-          <w:sz w:val="21"/>
-          <w:szCs w:val="21"/>
+          <w:sz w:val="20"/>
+          <w:szCs w:val="20"/>
         </w:rPr>
         <w:t xml:space="preserve">Published 2,000+ articles on public safety, crime and corruption.</w:t>
       </w:r>
@@ -419,10 +419,10 @@
         <w:rPr>
           <w:rFonts w:ascii="Cambria" w:cs="Cambria" w:eastAsia="Cambria" w:hAnsi="Cambria"/>
           <w:color w:val="111111"/>
-          <w:sz w:val="21"/>
-          <w:szCs w:val="21"/>
-        </w:rPr>
-        <w:t xml:space="preserve">Investigated city corruption cases with editor Perry White.</w:t>
+          <w:sz w:val="20"/>
+          <w:szCs w:val="20"/>
+        </w:rPr>
+        <w:t xml:space="preserve">Investigated city corruption cases with the news team.</w:t>
       </w:r>
     </w:p>
     <w:p>
@@ -438,8 +438,8 @@
         <w:rPr>
           <w:rFonts w:ascii="Cambria" w:cs="Cambria" w:eastAsia="Cambria" w:hAnsi="Cambria"/>
           <w:color w:val="111111"/>
-          <w:sz w:val="21"/>
-          <w:szCs w:val="21"/>
+          <w:sz w:val="20"/>
+          <w:szCs w:val="20"/>
         </w:rPr>
         <w:t xml:space="preserve">Met 100% of daily deadlines while working two full-time jobs.</w:t>
       </w:r>
@@ -457,8 +457,8 @@
           <w:b/>
           <w:bCs/>
           <w:color w:val="111111"/>
-          <w:sz w:val="21"/>
-          <w:szCs w:val="21"/>
+          <w:sz w:val="20"/>
+          <w:szCs w:val="20"/>
         </w:rPr>
         <w:t xml:space="preserve">Community Rescue Volunteer</w:t>
       </w:r>
@@ -466,8 +466,8 @@
         <w:rPr>
           <w:rFonts w:ascii="Cambria" w:cs="Cambria" w:eastAsia="Cambria" w:hAnsi="Cambria"/>
           <w:color w:val="111111"/>
-          <w:sz w:val="21"/>
-          <w:szCs w:val="21"/>
+          <w:sz w:val="20"/>
+          <w:szCs w:val="20"/>
         </w:rPr>
         <w:t xml:space="preserve">	1930/06 – 1934/08</w:t>
       </w:r>
@@ -485,19 +485,19 @@
           <w:i/>
           <w:iCs/>
           <w:color w:val="333333"/>
-          <w:sz w:val="21"/>
-          <w:szCs w:val="21"/>
-        </w:rPr>
-        <w:t xml:space="preserve">Smallville Community</w:t>
-      </w:r>
-      <w:r>
-        <w:rPr>
-          <w:rFonts w:ascii="Cambria" w:cs="Cambria" w:eastAsia="Cambria" w:hAnsi="Cambria"/>
-          <w:color w:val="111111"/>
-          <w:sz w:val="21"/>
-          <w:szCs w:val="21"/>
-        </w:rPr>
-        <w:t xml:space="preserve">	Smallville, Kansas</w:t>
+          <w:sz w:val="20"/>
+          <w:szCs w:val="20"/>
+        </w:rPr>
+        <w:t xml:space="preserve">Town Volunteers</w:t>
+      </w:r>
+      <w:r>
+        <w:rPr>
+          <w:rFonts w:ascii="Cambria" w:cs="Cambria" w:eastAsia="Cambria" w:hAnsi="Cambria"/>
+          <w:color w:val="111111"/>
+          <w:sz w:val="20"/>
+          <w:szCs w:val="20"/>
+        </w:rPr>
+        <w:t xml:space="preserve">	Smallville, USA</w:t>
       </w:r>
     </w:p>
     <w:p>
@@ -513,8 +513,8 @@
         <w:rPr>
           <w:rFonts w:ascii="Cambria" w:cs="Cambria" w:eastAsia="Cambria" w:hAnsi="Cambria"/>
           <w:color w:val="111111"/>
-          <w:sz w:val="21"/>
-          <w:szCs w:val="21"/>
+          <w:sz w:val="20"/>
+          <w:szCs w:val="20"/>
         </w:rPr>
         <w:t xml:space="preserve">Helped 100+ families during floods, fires and storms.</w:t>
       </w:r>
@@ -532,8 +532,8 @@
         <w:rPr>
           <w:rFonts w:ascii="Cambria" w:cs="Cambria" w:eastAsia="Cambria" w:hAnsi="Cambria"/>
           <w:color w:val="111111"/>
-          <w:sz w:val="21"/>
-          <w:szCs w:val="21"/>
+          <w:sz w:val="20"/>
+          <w:szCs w:val="20"/>
         </w:rPr>
         <w:t xml:space="preserve">Supported local farms with harvest work and emergency repairs.</w:t>
       </w:r>
@@ -543,7 +543,7 @@
         <w:pBdr>
           <w:bottom w:val="single" w:color="111111" w:sz="12" w:space="2"/>
         </w:pBdr>
-        <w:spacing w:after="100" w:before="220"/>
+        <w:spacing w:after="80" w:before="180"/>
       </w:pPr>
       <w:r>
         <w:rPr>
@@ -571,8 +571,8 @@
           <w:b/>
           <w:bCs/>
           <w:color w:val="111111"/>
-          <w:sz w:val="21"/>
-          <w:szCs w:val="21"/>
+          <w:sz w:val="20"/>
+          <w:szCs w:val="20"/>
         </w:rPr>
         <w:t xml:space="preserve">Bachelor of Arts in Journalism</w:t>
       </w:r>
@@ -580,8 +580,8 @@
         <w:rPr>
           <w:rFonts w:ascii="Cambria" w:cs="Cambria" w:eastAsia="Cambria" w:hAnsi="Cambria"/>
           <w:color w:val="111111"/>
-          <w:sz w:val="21"/>
-          <w:szCs w:val="21"/>
+          <w:sz w:val="20"/>
+          <w:szCs w:val="20"/>
         </w:rPr>
         <w:t xml:space="preserve">	1934 – 1938</w:t>
       </w:r>
@@ -599,17 +599,17 @@
           <w:i/>
           <w:iCs/>
           <w:color w:val="333333"/>
-          <w:sz w:val="21"/>
-          <w:szCs w:val="21"/>
-        </w:rPr>
-        <w:t xml:space="preserve">Metropolis University</w:t>
-      </w:r>
-      <w:r>
-        <w:rPr>
-          <w:rFonts w:ascii="Cambria" w:cs="Cambria" w:eastAsia="Cambria" w:hAnsi="Cambria"/>
-          <w:color w:val="111111"/>
-          <w:sz w:val="21"/>
-          <w:szCs w:val="21"/>
+          <w:sz w:val="20"/>
+          <w:szCs w:val="20"/>
+        </w:rPr>
+        <w:t xml:space="preserve">City University</w:t>
+      </w:r>
+      <w:r>
+        <w:rPr>
+          <w:rFonts w:ascii="Cambria" w:cs="Cambria" w:eastAsia="Cambria" w:hAnsi="Cambria"/>
+          <w:color w:val="111111"/>
+          <w:sz w:val="20"/>
+          <w:szCs w:val="20"/>
         </w:rPr>
         <w:t xml:space="preserve">	Metropolis, USA</w:t>
       </w:r>
@@ -619,7 +619,7 @@
         <w:pBdr>
           <w:bottom w:val="single" w:color="111111" w:sz="12" w:space="2"/>
         </w:pBdr>
-        <w:spacing w:after="100" w:before="220"/>
+        <w:spacing w:after="80" w:before="180"/>
       </w:pPr>
       <w:r>
         <w:rPr>
@@ -657,14 +657,14 @@
         <w:tabs>
           <w:tab w:val="left" w:pos="4873"/>
         </w:tabs>
-        <w:spacing w:after="50"/>
-      </w:pPr>
-      <w:r>
-        <w:rPr>
-          <w:rFonts w:ascii="Cambria" w:cs="Cambria" w:eastAsia="Cambria" w:hAnsi="Cambria"/>
-          <w:color w:val="111111"/>
-          <w:sz w:val="21"/>
-          <w:szCs w:val="21"/>
+        <w:spacing w:after="30"/>
+      </w:pPr>
+      <w:r>
+        <w:rPr>
+          <w:rFonts w:ascii="Cambria" w:cs="Cambria" w:eastAsia="Cambria" w:hAnsi="Cambria"/>
+          <w:color w:val="111111"/>
+          <w:sz w:val="20"/>
+          <w:szCs w:val="20"/>
         </w:rPr>
         <w:t xml:space="preserve">•  Emergency Rescue Operations</w:t>
       </w:r>
@@ -672,8 +672,8 @@
         <w:rPr>
           <w:rFonts w:ascii="Cambria" w:cs="Cambria" w:eastAsia="Cambria" w:hAnsi="Cambria"/>
           <w:color w:val="111111"/>
-          <w:sz w:val="21"/>
-          <w:szCs w:val="21"/>
+          <w:sz w:val="20"/>
+          <w:szCs w:val="20"/>
         </w:rPr>
         <w:t xml:space="preserve">	•  Risk Assessment</w:t>
       </w:r>
@@ -683,14 +683,14 @@
         <w:tabs>
           <w:tab w:val="left" w:pos="4873"/>
         </w:tabs>
-        <w:spacing w:after="50"/>
-      </w:pPr>
-      <w:r>
-        <w:rPr>
-          <w:rFonts w:ascii="Cambria" w:cs="Cambria" w:eastAsia="Cambria" w:hAnsi="Cambria"/>
-          <w:color w:val="111111"/>
-          <w:sz w:val="21"/>
-          <w:szCs w:val="21"/>
+        <w:spacing w:after="30"/>
+      </w:pPr>
+      <w:r>
+        <w:rPr>
+          <w:rFonts w:ascii="Cambria" w:cs="Cambria" w:eastAsia="Cambria" w:hAnsi="Cambria"/>
+          <w:color w:val="111111"/>
+          <w:sz w:val="20"/>
+          <w:szCs w:val="20"/>
         </w:rPr>
         <w:t xml:space="preserve">•  Investigative Research</w:t>
       </w:r>
@@ -698,8 +698,8 @@
         <w:rPr>
           <w:rFonts w:ascii="Cambria" w:cs="Cambria" w:eastAsia="Cambria" w:hAnsi="Cambria"/>
           <w:color w:val="111111"/>
-          <w:sz w:val="21"/>
-          <w:szCs w:val="21"/>
+          <w:sz w:val="20"/>
+          <w:szCs w:val="20"/>
         </w:rPr>
         <w:t xml:space="preserve">	•  Copywriting and Copyediting</w:t>
       </w:r>
@@ -709,14 +709,14 @@
         <w:tabs>
           <w:tab w:val="left" w:pos="4873"/>
         </w:tabs>
-        <w:spacing w:after="50"/>
-      </w:pPr>
-      <w:r>
-        <w:rPr>
-          <w:rFonts w:ascii="Cambria" w:cs="Cambria" w:eastAsia="Cambria" w:hAnsi="Cambria"/>
-          <w:color w:val="111111"/>
-          <w:sz w:val="21"/>
-          <w:szCs w:val="21"/>
+        <w:spacing w:after="30"/>
+      </w:pPr>
+      <w:r>
+        <w:rPr>
+          <w:rFonts w:ascii="Cambria" w:cs="Cambria" w:eastAsia="Cambria" w:hAnsi="Cambria"/>
+          <w:color w:val="111111"/>
+          <w:sz w:val="20"/>
+          <w:szCs w:val="20"/>
         </w:rPr>
         <w:t xml:space="preserve">•  Proofreading</w:t>
       </w:r>
@@ -724,8 +724,8 @@
         <w:rPr>
           <w:rFonts w:ascii="Cambria" w:cs="Cambria" w:eastAsia="Cambria" w:hAnsi="Cambria"/>
           <w:color w:val="111111"/>
-          <w:sz w:val="21"/>
-          <w:szCs w:val="21"/>
+          <w:sz w:val="20"/>
+          <w:szCs w:val="20"/>
         </w:rPr>
         <w:t xml:space="preserve">	•  Flight and Super Strength</w:t>
       </w:r>
@@ -753,14 +753,14 @@
         <w:tabs>
           <w:tab w:val="left" w:pos="4873"/>
         </w:tabs>
-        <w:spacing w:after="50"/>
-      </w:pPr>
-      <w:r>
-        <w:rPr>
-          <w:rFonts w:ascii="Cambria" w:cs="Cambria" w:eastAsia="Cambria" w:hAnsi="Cambria"/>
-          <w:color w:val="111111"/>
-          <w:sz w:val="21"/>
-          <w:szCs w:val="21"/>
+        <w:spacing w:after="30"/>
+      </w:pPr>
+      <w:r>
+        <w:rPr>
+          <w:rFonts w:ascii="Cambria" w:cs="Cambria" w:eastAsia="Cambria" w:hAnsi="Cambria"/>
+          <w:color w:val="111111"/>
+          <w:sz w:val="20"/>
+          <w:szCs w:val="20"/>
         </w:rPr>
         <w:t xml:space="preserve">•  Communication</w:t>
       </w:r>
@@ -768,8 +768,8 @@
         <w:rPr>
           <w:rFonts w:ascii="Cambria" w:cs="Cambria" w:eastAsia="Cambria" w:hAnsi="Cambria"/>
           <w:color w:val="111111"/>
-          <w:sz w:val="21"/>
-          <w:szCs w:val="21"/>
+          <w:sz w:val="20"/>
+          <w:szCs w:val="20"/>
         </w:rPr>
         <w:t xml:space="preserve">	•  Leadership</w:t>
       </w:r>
@@ -779,14 +779,14 @@
         <w:tabs>
           <w:tab w:val="left" w:pos="4873"/>
         </w:tabs>
-        <w:spacing w:after="50"/>
-      </w:pPr>
-      <w:r>
-        <w:rPr>
-          <w:rFonts w:ascii="Cambria" w:cs="Cambria" w:eastAsia="Cambria" w:hAnsi="Cambria"/>
-          <w:color w:val="111111"/>
-          <w:sz w:val="21"/>
-          <w:szCs w:val="21"/>
+        <w:spacing w:after="30"/>
+      </w:pPr>
+      <w:r>
+        <w:rPr>
+          <w:rFonts w:ascii="Cambria" w:cs="Cambria" w:eastAsia="Cambria" w:hAnsi="Cambria"/>
+          <w:color w:val="111111"/>
+          <w:sz w:val="20"/>
+          <w:szCs w:val="20"/>
         </w:rPr>
         <w:t xml:space="preserve">•  Teamwork</w:t>
       </w:r>
@@ -794,8 +794,8 @@
         <w:rPr>
           <w:rFonts w:ascii="Cambria" w:cs="Cambria" w:eastAsia="Cambria" w:hAnsi="Cambria"/>
           <w:color w:val="111111"/>
-          <w:sz w:val="21"/>
-          <w:szCs w:val="21"/>
+          <w:sz w:val="20"/>
+          <w:szCs w:val="20"/>
         </w:rPr>
         <w:t xml:space="preserve">	•  Problem-Solving</w:t>
       </w:r>
@@ -805,14 +805,14 @@
         <w:tabs>
           <w:tab w:val="left" w:pos="4873"/>
         </w:tabs>
-        <w:spacing w:after="50"/>
-      </w:pPr>
-      <w:r>
-        <w:rPr>
-          <w:rFonts w:ascii="Cambria" w:cs="Cambria" w:eastAsia="Cambria" w:hAnsi="Cambria"/>
-          <w:color w:val="111111"/>
-          <w:sz w:val="21"/>
-          <w:szCs w:val="21"/>
+        <w:spacing w:after="30"/>
+      </w:pPr>
+      <w:r>
+        <w:rPr>
+          <w:rFonts w:ascii="Cambria" w:cs="Cambria" w:eastAsia="Cambria" w:hAnsi="Cambria"/>
+          <w:color w:val="111111"/>
+          <w:sz w:val="20"/>
+          <w:szCs w:val="20"/>
         </w:rPr>
         <w:t xml:space="preserve">•  Decision-Making</w:t>
       </w:r>
@@ -820,8 +820,8 @@
         <w:rPr>
           <w:rFonts w:ascii="Cambria" w:cs="Cambria" w:eastAsia="Cambria" w:hAnsi="Cambria"/>
           <w:color w:val="111111"/>
-          <w:sz w:val="21"/>
-          <w:szCs w:val="21"/>
+          <w:sz w:val="20"/>
+          <w:szCs w:val="20"/>
         </w:rPr>
         <w:t xml:space="preserve">	•  Time Management</w:t>
       </w:r>
@@ -831,7 +831,7 @@
         <w:pBdr>
           <w:bottom w:val="single" w:color="111111" w:sz="12" w:space="2"/>
         </w:pBdr>
-        <w:spacing w:after="100" w:before="220"/>
+        <w:spacing w:after="80" w:before="180"/>
       </w:pPr>
       <w:r>
         <w:rPr>
@@ -851,14 +851,14 @@
         <w:tabs>
           <w:tab w:val="left" w:pos="4873"/>
         </w:tabs>
-        <w:spacing w:after="50"/>
-      </w:pPr>
-      <w:r>
-        <w:rPr>
-          <w:rFonts w:ascii="Cambria" w:cs="Cambria" w:eastAsia="Cambria" w:hAnsi="Cambria"/>
-          <w:color w:val="111111"/>
-          <w:sz w:val="21"/>
-          <w:szCs w:val="21"/>
+        <w:spacing w:after="30"/>
+      </w:pPr>
+      <w:r>
+        <w:rPr>
+          <w:rFonts w:ascii="Cambria" w:cs="Cambria" w:eastAsia="Cambria" w:hAnsi="Cambria"/>
+          <w:color w:val="111111"/>
+          <w:sz w:val="20"/>
+          <w:szCs w:val="20"/>
         </w:rPr>
         <w:t xml:space="preserve">•  Emergency First Aid and Rescue (1939)</w:t>
       </w:r>
@@ -866,8 +866,8 @@
         <w:rPr>
           <w:rFonts w:ascii="Cambria" w:cs="Cambria" w:eastAsia="Cambria" w:hAnsi="Cambria"/>
           <w:color w:val="111111"/>
-          <w:sz w:val="21"/>
-          <w:szCs w:val="21"/>
+          <w:sz w:val="20"/>
+          <w:szCs w:val="20"/>
         </w:rPr>
         <w:t xml:space="preserve">	•  Advanced Flight Safety (1940)</w:t>
       </w:r>
@@ -877,14 +877,14 @@
         <w:tabs>
           <w:tab w:val="left" w:pos="4873"/>
         </w:tabs>
-        <w:spacing w:after="50"/>
-      </w:pPr>
-      <w:r>
-        <w:rPr>
-          <w:rFonts w:ascii="Cambria" w:cs="Cambria" w:eastAsia="Cambria" w:hAnsi="Cambria"/>
-          <w:color w:val="111111"/>
-          <w:sz w:val="21"/>
-          <w:szCs w:val="21"/>
+        <w:spacing w:after="30"/>
+      </w:pPr>
+      <w:r>
+        <w:rPr>
+          <w:rFonts w:ascii="Cambria" w:cs="Cambria" w:eastAsia="Cambria" w:hAnsi="Cambria"/>
+          <w:color w:val="111111"/>
+          <w:sz w:val="20"/>
+          <w:szCs w:val="20"/>
         </w:rPr>
         <w:t xml:space="preserve">•  Crisis Leadership Program (1961)</w:t>
       </w:r>
@@ -892,10 +892,10 @@
         <w:rPr>
           <w:rFonts w:ascii="Cambria" w:cs="Cambria" w:eastAsia="Cambria" w:hAnsi="Cambria"/>
           <w:color w:val="111111"/>
-          <w:sz w:val="21"/>
-          <w:szCs w:val="21"/>
-        </w:rPr>
-        <w:t xml:space="preserve">	•  Key to the City of Metropolis (Award)</w:t>
+          <w:sz w:val="20"/>
+          <w:szCs w:val="20"/>
+        </w:rPr>
+        <w:t xml:space="preserve">	•  Key to the City (Award)</w:t>
       </w:r>
     </w:p>
     <w:p>
@@ -903,7 +903,7 @@
         <w:pBdr>
           <w:bottom w:val="single" w:color="111111" w:sz="12" w:space="2"/>
         </w:pBdr>
-        <w:spacing w:after="100" w:before="220"/>
+        <w:spacing w:after="80" w:before="180"/>
       </w:pPr>
       <w:r>
         <w:rPr>
@@ -923,14 +923,14 @@
         <w:tabs>
           <w:tab w:val="left" w:pos="4873"/>
         </w:tabs>
-        <w:spacing w:after="50"/>
-      </w:pPr>
-      <w:r>
-        <w:rPr>
-          <w:rFonts w:ascii="Cambria" w:cs="Cambria" w:eastAsia="Cambria" w:hAnsi="Cambria"/>
-          <w:color w:val="111111"/>
-          <w:sz w:val="21"/>
-          <w:szCs w:val="21"/>
+        <w:spacing w:after="30"/>
+      </w:pPr>
+      <w:r>
+        <w:rPr>
+          <w:rFonts w:ascii="Cambria" w:cs="Cambria" w:eastAsia="Cambria" w:hAnsi="Cambria"/>
+          <w:color w:val="111111"/>
+          <w:sz w:val="20"/>
+          <w:szCs w:val="20"/>
         </w:rPr>
         <w:t xml:space="preserve">•  English (Native)</w:t>
       </w:r>
@@ -938,15 +938,15 @@
         <w:rPr>
           <w:rFonts w:ascii="Cambria" w:cs="Cambria" w:eastAsia="Cambria" w:hAnsi="Cambria"/>
           <w:color w:val="111111"/>
-          <w:sz w:val="21"/>
-          <w:szCs w:val="21"/>
+          <w:sz w:val="20"/>
+          <w:szCs w:val="20"/>
         </w:rPr>
         <w:t xml:space="preserve">	•  Kryptonian (Native)</w:t>
       </w:r>
     </w:p>
     <w:sectPr>
       <w:pgSz w:w="11906" w:h="16838" w:orient="portrait"/>
-      <w:pgMar w:top="900" w:right="1080" w:bottom="800" w:left="1080" w:header="708" w:footer="708" w:gutter="0"/>
+      <w:pgMar w:top="800" w:right="1080" w:bottom="700" w:left="1080" w:header="708" w:footer="708" w:gutter="0"/>
       <w:pgNumType/>
       <w:docGrid w:linePitch="360"/>
     </w:sectPr>

</xml_diff>

<commit_message>
Use simple, easy-to-say English in Superman CV
Co-Authored-By: Claude Opus 5.5 <noreply@anthropic.com>
Claude-Session: https://claude.ai/code/session_01FBuHsgfNN7NePtiYw7LpVx
</commit_message>
<xml_diff>
--- a/Superman_CV.docx
+++ b/Superman_CV.docx
@@ -33,7 +33,7 @@
           <w:sz w:val="26"/>
           <w:szCs w:val="26"/>
         </w:rPr>
-        <w:t xml:space="preserve">Global Rescue and Crisis Response Specialist</w:t>
+        <w:t xml:space="preserve">Rescue and Safety Expert</w:t>
       </w:r>
     </w:p>
     <w:p>
@@ -82,7 +82,7 @@
           <w:sz w:val="20"/>
           <w:szCs w:val="20"/>
         </w:rPr>
-        <w:t xml:space="preserve">Crisis response specialist with 85+ years of experience protecting people and cities around the world. Rescued more than 1,000,000 people with a 99% mission success rate. Skilled in emergency response, team leadership and fast decision-making under pressure. Known for complete honesty, strong teamwork and never missing a deadline. Available 24/7 and ready to start immediately.</w:t>
+        <w:t xml:space="preserve">Rescue expert with 85+ years of experience. Saved more than 1,000,000 people with a 99% success rate. Good at helping people, leading teams and making fast decisions. Honest, strong and always on time. Ready to work 24/7 and start now.</w:t>
       </w:r>
     </w:p>
     <w:p>
@@ -121,7 +121,7 @@
           <w:sz w:val="20"/>
           <w:szCs w:val="20"/>
         </w:rPr>
-        <w:t xml:space="preserve">Global Protection Specialist</w:t>
+        <w:t xml:space="preserve">Rescue Expert</w:t>
       </w:r>
       <w:r>
         <w:rPr>
@@ -177,7 +177,7 @@
           <w:sz w:val="20"/>
           <w:szCs w:val="20"/>
         </w:rPr>
-        <w:t xml:space="preserve">Rescued 1,000,000+ people from natural disasters, accidents and attacks.</w:t>
+        <w:t xml:space="preserve">Saved 1,000,000+ people from fires, floods and accidents.</w:t>
       </w:r>
     </w:p>
     <w:p>
@@ -196,7 +196,7 @@
           <w:sz w:val="20"/>
           <w:szCs w:val="20"/>
         </w:rPr>
-        <w:t xml:space="preserve">Stopped 500+ high-risk threats, including Lex Luthor and General Zod.</w:t>
+        <w:t xml:space="preserve">Stopped 500+ villains, like Lex Luthor.</w:t>
       </w:r>
     </w:p>
     <w:p>
@@ -215,7 +215,7 @@
           <w:sz w:val="20"/>
           <w:szCs w:val="20"/>
         </w:rPr>
-        <w:t xml:space="preserve">Reduced emergency response time to under 10 seconds.</w:t>
+        <w:t xml:space="preserve">Reached people in less than 10 seconds.</w:t>
       </w:r>
     </w:p>
     <w:p>
@@ -234,7 +234,7 @@
           <w:sz w:val="20"/>
           <w:szCs w:val="20"/>
         </w:rPr>
-        <w:t xml:space="preserve">Founding Member and Team Leader</w:t>
+        <w:t xml:space="preserve">Team Leader</w:t>
       </w:r>
       <w:r>
         <w:rPr>
@@ -290,7 +290,7 @@
           <w:sz w:val="20"/>
           <w:szCs w:val="20"/>
         </w:rPr>
-        <w:t xml:space="preserve">Co-founded a 7-member international team with Batman and Wonder Woman.</w:t>
+        <w:t xml:space="preserve">Started a team of 7 heroes with Batman and Wonder Woman.</w:t>
       </w:r>
     </w:p>
     <w:p>
@@ -309,7 +309,7 @@
           <w:sz w:val="20"/>
           <w:szCs w:val="20"/>
         </w:rPr>
-        <w:t xml:space="preserve">Led high-risk missions with a 99% success rate.</w:t>
+        <w:t xml:space="preserve">Led missions with a 99% success rate.</w:t>
       </w:r>
     </w:p>
     <w:p>
@@ -328,7 +328,7 @@
           <w:sz w:val="20"/>
           <w:szCs w:val="20"/>
         </w:rPr>
-        <w:t xml:space="preserve">Coordinated with governments during 100+ global emergencies.</w:t>
+        <w:t xml:space="preserve">Helped in 100+ big problems around the world.</w:t>
       </w:r>
     </w:p>
     <w:p>
@@ -347,7 +347,7 @@
           <w:sz w:val="20"/>
           <w:szCs w:val="20"/>
         </w:rPr>
-        <w:t xml:space="preserve">Investigative Reporter</w:t>
+        <w:t xml:space="preserve">News Reporter</w:t>
       </w:r>
       <w:r>
         <w:rPr>
@@ -403,7 +403,7 @@
           <w:sz w:val="20"/>
           <w:szCs w:val="20"/>
         </w:rPr>
-        <w:t xml:space="preserve">Published 2,000+ articles on public safety, crime and corruption.</w:t>
+        <w:t xml:space="preserve">Wrote 2,000+ news stories.</w:t>
       </w:r>
     </w:p>
     <w:p>
@@ -422,7 +422,7 @@
           <w:sz w:val="20"/>
           <w:szCs w:val="20"/>
         </w:rPr>
-        <w:t xml:space="preserve">Investigated city corruption cases with the news team.</w:t>
+        <w:t xml:space="preserve">Found and reported crimes in the city.</w:t>
       </w:r>
     </w:p>
     <w:p>
@@ -441,7 +441,7 @@
           <w:sz w:val="20"/>
           <w:szCs w:val="20"/>
         </w:rPr>
-        <w:t xml:space="preserve">Met 100% of daily deadlines while working two full-time jobs.</w:t>
+        <w:t xml:space="preserve">Never missed a deadline.</w:t>
       </w:r>
     </w:p>
     <w:p>
@@ -460,7 +460,7 @@
           <w:sz w:val="20"/>
           <w:szCs w:val="20"/>
         </w:rPr>
-        <w:t xml:space="preserve">Community Rescue Volunteer</w:t>
+        <w:t xml:space="preserve">Volunteer</w:t>
       </w:r>
       <w:r>
         <w:rPr>
@@ -516,7 +516,7 @@
           <w:sz w:val="20"/>
           <w:szCs w:val="20"/>
         </w:rPr>
-        <w:t xml:space="preserve">Helped 100+ families during floods, fires and storms.</w:t>
+        <w:t xml:space="preserve">Helped 100+ families in floods and storms.</w:t>
       </w:r>
     </w:p>
     <w:p>
@@ -535,7 +535,7 @@
           <w:sz w:val="20"/>
           <w:szCs w:val="20"/>
         </w:rPr>
-        <w:t xml:space="preserve">Supported local farms with harvest work and emergency repairs.</w:t>
+        <w:t xml:space="preserve">Helped local farms with their work.</w:t>
       </w:r>
     </w:p>
     <w:p>
@@ -574,7 +574,7 @@
           <w:sz w:val="20"/>
           <w:szCs w:val="20"/>
         </w:rPr>
-        <w:t xml:space="preserve">Bachelor of Arts in Journalism</w:t>
+        <w:t xml:space="preserve">Bachelor's Degree in Media</w:t>
       </w:r>
       <w:r>
         <w:rPr>
@@ -666,16 +666,16 @@
           <w:sz w:val="20"/>
           <w:szCs w:val="20"/>
         </w:rPr>
-        <w:t xml:space="preserve">•  Emergency Rescue Operations</w:t>
-      </w:r>
-      <w:r>
-        <w:rPr>
-          <w:rFonts w:ascii="Cambria" w:cs="Cambria" w:eastAsia="Cambria" w:hAnsi="Cambria"/>
-          <w:color w:val="111111"/>
-          <w:sz w:val="20"/>
-          <w:szCs w:val="20"/>
-        </w:rPr>
-        <w:t xml:space="preserve">	•  Risk Assessment</w:t>
+        <w:t xml:space="preserve">•  Rescue</w:t>
+      </w:r>
+      <w:r>
+        <w:rPr>
+          <w:rFonts w:ascii="Cambria" w:cs="Cambria" w:eastAsia="Cambria" w:hAnsi="Cambria"/>
+          <w:color w:val="111111"/>
+          <w:sz w:val="20"/>
+          <w:szCs w:val="20"/>
+        </w:rPr>
+        <w:t xml:space="preserve">	•  First Aid</w:t>
       </w:r>
     </w:p>
     <w:p>
@@ -692,16 +692,16 @@
           <w:sz w:val="20"/>
           <w:szCs w:val="20"/>
         </w:rPr>
-        <w:t xml:space="preserve">•  Investigative Research</w:t>
-      </w:r>
-      <w:r>
-        <w:rPr>
-          <w:rFonts w:ascii="Cambria" w:cs="Cambria" w:eastAsia="Cambria" w:hAnsi="Cambria"/>
-          <w:color w:val="111111"/>
-          <w:sz w:val="20"/>
-          <w:szCs w:val="20"/>
-        </w:rPr>
-        <w:t xml:space="preserve">	•  Copywriting and Copyediting</w:t>
+        <w:t xml:space="preserve">•  Flying</w:t>
+      </w:r>
+      <w:r>
+        <w:rPr>
+          <w:rFonts w:ascii="Cambria" w:cs="Cambria" w:eastAsia="Cambria" w:hAnsi="Cambria"/>
+          <w:color w:val="111111"/>
+          <w:sz w:val="20"/>
+          <w:szCs w:val="20"/>
+        </w:rPr>
+        <w:t xml:space="preserve">	•  Super Strength</w:t>
       </w:r>
     </w:p>
     <w:p>
@@ -718,16 +718,16 @@
           <w:sz w:val="20"/>
           <w:szCs w:val="20"/>
         </w:rPr>
-        <w:t xml:space="preserve">•  Proofreading</w:t>
-      </w:r>
-      <w:r>
-        <w:rPr>
-          <w:rFonts w:ascii="Cambria" w:cs="Cambria" w:eastAsia="Cambria" w:hAnsi="Cambria"/>
-          <w:color w:val="111111"/>
-          <w:sz w:val="20"/>
-          <w:szCs w:val="20"/>
-        </w:rPr>
-        <w:t xml:space="preserve">	•  Flight and Super Strength</w:t>
+        <w:t xml:space="preserve">•  Writing</w:t>
+      </w:r>
+      <w:r>
+        <w:rPr>
+          <w:rFonts w:ascii="Cambria" w:cs="Cambria" w:eastAsia="Cambria" w:hAnsi="Cambria"/>
+          <w:color w:val="111111"/>
+          <w:sz w:val="20"/>
+          <w:szCs w:val="20"/>
+        </w:rPr>
+        <w:t xml:space="preserve">	•  Research</w:t>
       </w:r>
     </w:p>
     <w:p>
@@ -814,7 +814,7 @@
           <w:sz w:val="20"/>
           <w:szCs w:val="20"/>
         </w:rPr>
-        <w:t xml:space="preserve">•  Decision-Making</w:t>
+        <w:t xml:space="preserve">•  Fast Decisions</w:t>
       </w:r>
       <w:r>
         <w:rPr>
@@ -860,16 +860,16 @@
           <w:sz w:val="20"/>
           <w:szCs w:val="20"/>
         </w:rPr>
-        <w:t xml:space="preserve">•  Emergency First Aid and Rescue (1939)</w:t>
-      </w:r>
-      <w:r>
-        <w:rPr>
-          <w:rFonts w:ascii="Cambria" w:cs="Cambria" w:eastAsia="Cambria" w:hAnsi="Cambria"/>
-          <w:color w:val="111111"/>
-          <w:sz w:val="20"/>
-          <w:szCs w:val="20"/>
-        </w:rPr>
-        <w:t xml:space="preserve">	•  Advanced Flight Safety (1940)</w:t>
+        <w:t xml:space="preserve">•  First Aid (1939)</w:t>
+      </w:r>
+      <w:r>
+        <w:rPr>
+          <w:rFonts w:ascii="Cambria" w:cs="Cambria" w:eastAsia="Cambria" w:hAnsi="Cambria"/>
+          <w:color w:val="111111"/>
+          <w:sz w:val="20"/>
+          <w:szCs w:val="20"/>
+        </w:rPr>
+        <w:t xml:space="preserve">	•  Safe Flying (1940)</w:t>
       </w:r>
     </w:p>
     <w:p>
@@ -886,7 +886,7 @@
           <w:sz w:val="20"/>
           <w:szCs w:val="20"/>
         </w:rPr>
-        <w:t xml:space="preserve">•  Crisis Leadership Program (1961)</w:t>
+        <w:t xml:space="preserve">•  Team Leadership (1961)</w:t>
       </w:r>
       <w:r>
         <w:rPr>

</xml_diff>

<commit_message>
Restore full Superman CV content in simple English
Co-Authored-By: Claude Opus 5.5 <noreply@anthropic.com>
Claude-Session: https://claude.ai/code/session_01FBuHsgfNN7NePtiYw7LpVx
</commit_message>
<xml_diff>
--- a/Superman_CV.docx
+++ b/Superman_CV.docx
@@ -33,7 +33,7 @@
           <w:sz w:val="26"/>
           <w:szCs w:val="26"/>
         </w:rPr>
-        <w:t xml:space="preserve">Rescue and Safety Expert</w:t>
+        <w:t xml:space="preserve">Global Rescue and Safety Expert</w:t>
       </w:r>
     </w:p>
     <w:p>
@@ -82,7 +82,7 @@
           <w:sz w:val="20"/>
           <w:szCs w:val="20"/>
         </w:rPr>
-        <w:t xml:space="preserve">Rescue expert with 85+ years of experience. Saved more than 1,000,000 people with a 99% success rate. Good at helping people, leading teams and making fast decisions. Honest, strong and always on time. Ready to work 24/7 and start now.</w:t>
+        <w:t xml:space="preserve">Rescue expert with 85+ years of experience helping people and keeping cities safe around the world. Saved more than 1,000,000 people with a 99% success rate. Good at rescue work, leading teams and making fast decisions in hard times. Known for being honest, working well with others and always finishing work on time. Ready to work 24/7 and start right away.</w:t>
       </w:r>
     </w:p>
     <w:p>
@@ -121,7 +121,7 @@
           <w:sz w:val="20"/>
           <w:szCs w:val="20"/>
         </w:rPr>
-        <w:t xml:space="preserve">Rescue Expert</w:t>
+        <w:t xml:space="preserve">Global Rescue Expert</w:t>
       </w:r>
       <w:r>
         <w:rPr>
@@ -177,7 +177,7 @@
           <w:sz w:val="20"/>
           <w:szCs w:val="20"/>
         </w:rPr>
-        <w:t xml:space="preserve">Saved 1,000,000+ people from fires, floods and accidents.</w:t>
+        <w:t xml:space="preserve">Saved 1,000,000+ people from fires, floods, accidents and attacks.</w:t>
       </w:r>
     </w:p>
     <w:p>
@@ -196,7 +196,7 @@
           <w:sz w:val="20"/>
           <w:szCs w:val="20"/>
         </w:rPr>
-        <w:t xml:space="preserve">Stopped 500+ villains, like Lex Luthor.</w:t>
+        <w:t xml:space="preserve">Stopped 500+ dangerous villains, like Lex Luthor and General Zod.</w:t>
       </w:r>
     </w:p>
     <w:p>
@@ -215,7 +215,7 @@
           <w:sz w:val="20"/>
           <w:szCs w:val="20"/>
         </w:rPr>
-        <w:t xml:space="preserve">Reached people in less than 10 seconds.</w:t>
+        <w:t xml:space="preserve">Reached people who needed help in less than 10 seconds.</w:t>
       </w:r>
     </w:p>
     <w:p>
@@ -234,7 +234,7 @@
           <w:sz w:val="20"/>
           <w:szCs w:val="20"/>
         </w:rPr>
-        <w:t xml:space="preserve">Team Leader</w:t>
+        <w:t xml:space="preserve">Team Founder and Leader</w:t>
       </w:r>
       <w:r>
         <w:rPr>
@@ -309,7 +309,7 @@
           <w:sz w:val="20"/>
           <w:szCs w:val="20"/>
         </w:rPr>
-        <w:t xml:space="preserve">Led missions with a 99% success rate.</w:t>
+        <w:t xml:space="preserve">Led dangerous missions with a 99% success rate.</w:t>
       </w:r>
     </w:p>
     <w:p>
@@ -328,7 +328,7 @@
           <w:sz w:val="20"/>
           <w:szCs w:val="20"/>
         </w:rPr>
-        <w:t xml:space="preserve">Helped in 100+ big problems around the world.</w:t>
+        <w:t xml:space="preserve">Worked with world leaders in 100+ big emergencies.</w:t>
       </w:r>
     </w:p>
     <w:p>
@@ -403,7 +403,7 @@
           <w:sz w:val="20"/>
           <w:szCs w:val="20"/>
         </w:rPr>
-        <w:t xml:space="preserve">Wrote 2,000+ news stories.</w:t>
+        <w:t xml:space="preserve">Wrote 2,000+ news stories about safety, crime and city problems.</w:t>
       </w:r>
     </w:p>
     <w:p>
@@ -422,7 +422,7 @@
           <w:sz w:val="20"/>
           <w:szCs w:val="20"/>
         </w:rPr>
-        <w:t xml:space="preserve">Found and reported crimes in the city.</w:t>
+        <w:t xml:space="preserve">Found and reported crimes in the city with the news team.</w:t>
       </w:r>
     </w:p>
     <w:p>
@@ -441,7 +441,7 @@
           <w:sz w:val="20"/>
           <w:szCs w:val="20"/>
         </w:rPr>
-        <w:t xml:space="preserve">Never missed a deadline.</w:t>
+        <w:t xml:space="preserve">Finished all daily work on time while doing two full-time jobs.</w:t>
       </w:r>
     </w:p>
     <w:p>
@@ -460,7 +460,7 @@
           <w:sz w:val="20"/>
           <w:szCs w:val="20"/>
         </w:rPr>
-        <w:t xml:space="preserve">Volunteer</w:t>
+        <w:t xml:space="preserve">Rescue Volunteer</w:t>
       </w:r>
       <w:r>
         <w:rPr>
@@ -516,7 +516,7 @@
           <w:sz w:val="20"/>
           <w:szCs w:val="20"/>
         </w:rPr>
-        <w:t xml:space="preserve">Helped 100+ families in floods and storms.</w:t>
+        <w:t xml:space="preserve">Helped 100+ families during floods, fires and storms.</w:t>
       </w:r>
     </w:p>
     <w:p>
@@ -535,7 +535,7 @@
           <w:sz w:val="20"/>
           <w:szCs w:val="20"/>
         </w:rPr>
-        <w:t xml:space="preserve">Helped local farms with their work.</w:t>
+        <w:t xml:space="preserve">Helped local farms with harvest work and repairs.</w:t>
       </w:r>
     </w:p>
     <w:p>
@@ -666,7 +666,7 @@
           <w:sz w:val="20"/>
           <w:szCs w:val="20"/>
         </w:rPr>
-        <w:t xml:space="preserve">•  Rescue</w:t>
+        <w:t xml:space="preserve">•  Rescue Work</w:t>
       </w:r>
       <w:r>
         <w:rPr>
@@ -692,16 +692,16 @@
           <w:sz w:val="20"/>
           <w:szCs w:val="20"/>
         </w:rPr>
-        <w:t xml:space="preserve">•  Flying</w:t>
-      </w:r>
-      <w:r>
-        <w:rPr>
-          <w:rFonts w:ascii="Cambria" w:cs="Cambria" w:eastAsia="Cambria" w:hAnsi="Cambria"/>
-          <w:color w:val="111111"/>
-          <w:sz w:val="20"/>
-          <w:szCs w:val="20"/>
-        </w:rPr>
-        <w:t xml:space="preserve">	•  Super Strength</w:t>
+        <w:t xml:space="preserve">•  Research</w:t>
+      </w:r>
+      <w:r>
+        <w:rPr>
+          <w:rFonts w:ascii="Cambria" w:cs="Cambria" w:eastAsia="Cambria" w:hAnsi="Cambria"/>
+          <w:color w:val="111111"/>
+          <w:sz w:val="20"/>
+          <w:szCs w:val="20"/>
+        </w:rPr>
+        <w:t xml:space="preserve">	•  Writing and Editing</w:t>
       </w:r>
     </w:p>
     <w:p>
@@ -718,16 +718,16 @@
           <w:sz w:val="20"/>
           <w:szCs w:val="20"/>
         </w:rPr>
-        <w:t xml:space="preserve">•  Writing</w:t>
-      </w:r>
-      <w:r>
-        <w:rPr>
-          <w:rFonts w:ascii="Cambria" w:cs="Cambria" w:eastAsia="Cambria" w:hAnsi="Cambria"/>
-          <w:color w:val="111111"/>
-          <w:sz w:val="20"/>
-          <w:szCs w:val="20"/>
-        </w:rPr>
-        <w:t xml:space="preserve">	•  Research</w:t>
+        <w:t xml:space="preserve">•  Safety Planning</w:t>
+      </w:r>
+      <w:r>
+        <w:rPr>
+          <w:rFonts w:ascii="Cambria" w:cs="Cambria" w:eastAsia="Cambria" w:hAnsi="Cambria"/>
+          <w:color w:val="111111"/>
+          <w:sz w:val="20"/>
+          <w:szCs w:val="20"/>
+        </w:rPr>
+        <w:t xml:space="preserve">	•  Flying and Super Strength</w:t>
       </w:r>
     </w:p>
     <w:p>
@@ -860,7 +860,7 @@
           <w:sz w:val="20"/>
           <w:szCs w:val="20"/>
         </w:rPr>
-        <w:t xml:space="preserve">•  First Aid (1939)</w:t>
+        <w:t xml:space="preserve">•  First Aid and Rescue (1939)</w:t>
       </w:r>
       <w:r>
         <w:rPr>
@@ -886,7 +886,7 @@
           <w:sz w:val="20"/>
           <w:szCs w:val="20"/>
         </w:rPr>
-        <w:t xml:space="preserve">•  Team Leadership (1961)</w:t>
+        <w:t xml:space="preserve">•  Team Leadership Course (1961)</w:t>
       </w:r>
       <w:r>
         <w:rPr>

</xml_diff>

<commit_message>
Remove the word rescue from Superman CV
Co-Authored-By: Claude Opus 5.5 <noreply@anthropic.com>
Claude-Session: https://claude.ai/code/session_01FBuHsgfNN7NePtiYw7LpVx
</commit_message>
<xml_diff>
--- a/Superman_CV.docx
+++ b/Superman_CV.docx
@@ -33,7 +33,7 @@
           <w:sz w:val="26"/>
           <w:szCs w:val="26"/>
         </w:rPr>
-        <w:t xml:space="preserve">Global Rescue and Safety Expert</w:t>
+        <w:t xml:space="preserve">Global Safety Expert</w:t>
       </w:r>
     </w:p>
     <w:p>
@@ -82,7 +82,7 @@
           <w:sz w:val="20"/>
           <w:szCs w:val="20"/>
         </w:rPr>
-        <w:t xml:space="preserve">Rescue expert with 85+ years of experience helping people and keeping cities safe around the world. Saved more than 1,000,000 people with a 99% success rate. Good at rescue work, leading teams and making fast decisions in hard times. Known for being honest, working well with others and always finishing work on time. Ready to work 24/7 and start right away.</w:t>
+        <w:t xml:space="preserve">Safety expert with 85+ years of experience helping people and keeping cities safe around the world. Saved more than 1,000,000 people with a 99% success rate. Good at saving people, leading teams and making fast decisions in hard times. Known for being honest, working well with others and always finishing work on time. Ready to work 24/7 and start right away.</w:t>
       </w:r>
     </w:p>
     <w:p>
@@ -121,7 +121,7 @@
           <w:sz w:val="20"/>
           <w:szCs w:val="20"/>
         </w:rPr>
-        <w:t xml:space="preserve">Global Rescue Expert</w:t>
+        <w:t xml:space="preserve">Superhero</w:t>
       </w:r>
       <w:r>
         <w:rPr>
@@ -460,7 +460,7 @@
           <w:sz w:val="20"/>
           <w:szCs w:val="20"/>
         </w:rPr>
-        <w:t xml:space="preserve">Rescue Volunteer</w:t>
+        <w:t xml:space="preserve">Town Volunteer</w:t>
       </w:r>
       <w:r>
         <w:rPr>
@@ -666,7 +666,7 @@
           <w:sz w:val="20"/>
           <w:szCs w:val="20"/>
         </w:rPr>
-        <w:t xml:space="preserve">•  Rescue Work</w:t>
+        <w:t xml:space="preserve">•  Saving People</w:t>
       </w:r>
       <w:r>
         <w:rPr>
@@ -860,7 +860,7 @@
           <w:sz w:val="20"/>
           <w:szCs w:val="20"/>
         </w:rPr>
-        <w:t xml:space="preserve">•  First Aid and Rescue (1939)</w:t>
+        <w:t xml:space="preserve">•  First Aid (1939)</w:t>
       </w:r>
       <w:r>
         <w:rPr>

</xml_diff>

<commit_message>
Remove volunteer job from Superman CV
Co-Authored-By: Claude Opus 5.5 <noreply@anthropic.com>
Claude-Session: https://claude.ai/code/session_01FBuHsgfNN7NePtiYw7LpVx
</commit_message>
<xml_diff>
--- a/Superman_CV.docx
+++ b/Superman_CV.docx
@@ -56,7 +56,7 @@
         <w:pBdr>
           <w:bottom w:val="single" w:color="111111" w:sz="12" w:space="2"/>
         </w:pBdr>
-        <w:spacing w:after="80" w:before="180"/>
+        <w:spacing w:after="100" w:before="220"/>
       </w:pPr>
       <w:r>
         <w:rPr>
@@ -79,8 +79,8 @@
         <w:rPr>
           <w:rFonts w:ascii="Cambria" w:cs="Cambria" w:eastAsia="Cambria" w:hAnsi="Cambria"/>
           <w:color w:val="111111"/>
-          <w:sz w:val="20"/>
-          <w:szCs w:val="20"/>
+          <w:sz w:val="22"/>
+          <w:szCs w:val="22"/>
         </w:rPr>
         <w:t xml:space="preserve">Safety expert with 85+ years of experience helping people and keeping cities safe around the world. Saved more than 1,000,000 people with a 99% success rate. Good at saving people, leading teams and making fast decisions in hard times. Known for being honest, working well with others and always finishing work on time. Ready to work 24/7 and start right away.</w:t>
       </w:r>
@@ -90,7 +90,7 @@
         <w:pBdr>
           <w:bottom w:val="single" w:color="111111" w:sz="12" w:space="2"/>
         </w:pBdr>
-        <w:spacing w:after="80" w:before="180"/>
+        <w:spacing w:after="100" w:before="220"/>
       </w:pPr>
       <w:r>
         <w:rPr>
@@ -118,8 +118,8 @@
           <w:b/>
           <w:bCs/>
           <w:color w:val="111111"/>
-          <w:sz w:val="20"/>
-          <w:szCs w:val="20"/>
+          <w:sz w:val="22"/>
+          <w:szCs w:val="22"/>
         </w:rPr>
         <w:t xml:space="preserve">Superhero</w:t>
       </w:r>
@@ -127,8 +127,8 @@
         <w:rPr>
           <w:rFonts w:ascii="Cambria" w:cs="Cambria" w:eastAsia="Cambria" w:hAnsi="Cambria"/>
           <w:color w:val="111111"/>
-          <w:sz w:val="20"/>
-          <w:szCs w:val="20"/>
+          <w:sz w:val="22"/>
+          <w:szCs w:val="22"/>
         </w:rPr>
         <w:t xml:space="preserve">	1938/06 – Present</w:t>
       </w:r>
@@ -146,8 +146,8 @@
           <w:i/>
           <w:iCs/>
           <w:color w:val="333333"/>
-          <w:sz w:val="20"/>
-          <w:szCs w:val="20"/>
+          <w:sz w:val="22"/>
+          <w:szCs w:val="22"/>
         </w:rPr>
         <w:t xml:space="preserve">Freelance</w:t>
       </w:r>
@@ -155,8 +155,8 @@
         <w:rPr>
           <w:rFonts w:ascii="Cambria" w:cs="Cambria" w:eastAsia="Cambria" w:hAnsi="Cambria"/>
           <w:color w:val="111111"/>
-          <w:sz w:val="20"/>
-          <w:szCs w:val="20"/>
+          <w:sz w:val="22"/>
+          <w:szCs w:val="22"/>
         </w:rPr>
         <w:t xml:space="preserve">	Metropolis, USA</w:t>
       </w:r>
@@ -174,8 +174,8 @@
         <w:rPr>
           <w:rFonts w:ascii="Cambria" w:cs="Cambria" w:eastAsia="Cambria" w:hAnsi="Cambria"/>
           <w:color w:val="111111"/>
-          <w:sz w:val="20"/>
-          <w:szCs w:val="20"/>
+          <w:sz w:val="22"/>
+          <w:szCs w:val="22"/>
         </w:rPr>
         <w:t xml:space="preserve">Saved 1,000,000+ people from fires, floods, accidents and attacks.</w:t>
       </w:r>
@@ -193,8 +193,8 @@
         <w:rPr>
           <w:rFonts w:ascii="Cambria" w:cs="Cambria" w:eastAsia="Cambria" w:hAnsi="Cambria"/>
           <w:color w:val="111111"/>
-          <w:sz w:val="20"/>
-          <w:szCs w:val="20"/>
+          <w:sz w:val="22"/>
+          <w:szCs w:val="22"/>
         </w:rPr>
         <w:t xml:space="preserve">Stopped 500+ dangerous villains, like Lex Luthor and General Zod.</w:t>
       </w:r>
@@ -212,8 +212,8 @@
         <w:rPr>
           <w:rFonts w:ascii="Cambria" w:cs="Cambria" w:eastAsia="Cambria" w:hAnsi="Cambria"/>
           <w:color w:val="111111"/>
-          <w:sz w:val="20"/>
-          <w:szCs w:val="20"/>
+          <w:sz w:val="22"/>
+          <w:szCs w:val="22"/>
         </w:rPr>
         <w:t xml:space="preserve">Reached people who needed help in less than 10 seconds.</w:t>
       </w:r>
@@ -231,8 +231,8 @@
           <w:b/>
           <w:bCs/>
           <w:color w:val="111111"/>
-          <w:sz w:val="20"/>
-          <w:szCs w:val="20"/>
+          <w:sz w:val="22"/>
+          <w:szCs w:val="22"/>
         </w:rPr>
         <w:t xml:space="preserve">Team Founder and Leader</w:t>
       </w:r>
@@ -240,8 +240,8 @@
         <w:rPr>
           <w:rFonts w:ascii="Cambria" w:cs="Cambria" w:eastAsia="Cambria" w:hAnsi="Cambria"/>
           <w:color w:val="111111"/>
-          <w:sz w:val="20"/>
-          <w:szCs w:val="20"/>
+          <w:sz w:val="22"/>
+          <w:szCs w:val="22"/>
         </w:rPr>
         <w:t xml:space="preserve">	1960/11 – Present</w:t>
       </w:r>
@@ -259,8 +259,8 @@
           <w:i/>
           <w:iCs/>
           <w:color w:val="333333"/>
-          <w:sz w:val="20"/>
-          <w:szCs w:val="20"/>
+          <w:sz w:val="22"/>
+          <w:szCs w:val="22"/>
         </w:rPr>
         <w:t xml:space="preserve">Hero Team</w:t>
       </w:r>
@@ -268,8 +268,8 @@
         <w:rPr>
           <w:rFonts w:ascii="Cambria" w:cs="Cambria" w:eastAsia="Cambria" w:hAnsi="Cambria"/>
           <w:color w:val="111111"/>
-          <w:sz w:val="20"/>
-          <w:szCs w:val="20"/>
+          <w:sz w:val="22"/>
+          <w:szCs w:val="22"/>
         </w:rPr>
         <w:t xml:space="preserve">	Worldwide</w:t>
       </w:r>
@@ -287,8 +287,8 @@
         <w:rPr>
           <w:rFonts w:ascii="Cambria" w:cs="Cambria" w:eastAsia="Cambria" w:hAnsi="Cambria"/>
           <w:color w:val="111111"/>
-          <w:sz w:val="20"/>
-          <w:szCs w:val="20"/>
+          <w:sz w:val="22"/>
+          <w:szCs w:val="22"/>
         </w:rPr>
         <w:t xml:space="preserve">Started a team of 7 heroes with Batman and Wonder Woman.</w:t>
       </w:r>
@@ -306,8 +306,8 @@
         <w:rPr>
           <w:rFonts w:ascii="Cambria" w:cs="Cambria" w:eastAsia="Cambria" w:hAnsi="Cambria"/>
           <w:color w:val="111111"/>
-          <w:sz w:val="20"/>
-          <w:szCs w:val="20"/>
+          <w:sz w:val="22"/>
+          <w:szCs w:val="22"/>
         </w:rPr>
         <w:t xml:space="preserve">Led dangerous missions with a 99% success rate.</w:t>
       </w:r>
@@ -325,8 +325,8 @@
         <w:rPr>
           <w:rFonts w:ascii="Cambria" w:cs="Cambria" w:eastAsia="Cambria" w:hAnsi="Cambria"/>
           <w:color w:val="111111"/>
-          <w:sz w:val="20"/>
-          <w:szCs w:val="20"/>
+          <w:sz w:val="22"/>
+          <w:szCs w:val="22"/>
         </w:rPr>
         <w:t xml:space="preserve">Worked with world leaders in 100+ big emergencies.</w:t>
       </w:r>
@@ -344,8 +344,8 @@
           <w:b/>
           <w:bCs/>
           <w:color w:val="111111"/>
-          <w:sz w:val="20"/>
-          <w:szCs w:val="20"/>
+          <w:sz w:val="22"/>
+          <w:szCs w:val="22"/>
         </w:rPr>
         <w:t xml:space="preserve">News Reporter</w:t>
       </w:r>
@@ -353,8 +353,8 @@
         <w:rPr>
           <w:rFonts w:ascii="Cambria" w:cs="Cambria" w:eastAsia="Cambria" w:hAnsi="Cambria"/>
           <w:color w:val="111111"/>
-          <w:sz w:val="20"/>
-          <w:szCs w:val="20"/>
+          <w:sz w:val="22"/>
+          <w:szCs w:val="22"/>
         </w:rPr>
         <w:t xml:space="preserve">	1938/06 – Present</w:t>
       </w:r>
@@ -372,8 +372,8 @@
           <w:i/>
           <w:iCs/>
           <w:color w:val="333333"/>
-          <w:sz w:val="20"/>
-          <w:szCs w:val="20"/>
+          <w:sz w:val="22"/>
+          <w:szCs w:val="22"/>
         </w:rPr>
         <w:t xml:space="preserve">City News</w:t>
       </w:r>
@@ -381,8 +381,8 @@
         <w:rPr>
           <w:rFonts w:ascii="Cambria" w:cs="Cambria" w:eastAsia="Cambria" w:hAnsi="Cambria"/>
           <w:color w:val="111111"/>
-          <w:sz w:val="20"/>
-          <w:szCs w:val="20"/>
+          <w:sz w:val="22"/>
+          <w:szCs w:val="22"/>
         </w:rPr>
         <w:t xml:space="preserve">	Metropolis, USA</w:t>
       </w:r>
@@ -400,8 +400,8 @@
         <w:rPr>
           <w:rFonts w:ascii="Cambria" w:cs="Cambria" w:eastAsia="Cambria" w:hAnsi="Cambria"/>
           <w:color w:val="111111"/>
-          <w:sz w:val="20"/>
-          <w:szCs w:val="20"/>
+          <w:sz w:val="22"/>
+          <w:szCs w:val="22"/>
         </w:rPr>
         <w:t xml:space="preserve">Wrote 2,000+ news stories about safety, crime and city problems.</w:t>
       </w:r>
@@ -419,8 +419,8 @@
         <w:rPr>
           <w:rFonts w:ascii="Cambria" w:cs="Cambria" w:eastAsia="Cambria" w:hAnsi="Cambria"/>
           <w:color w:val="111111"/>
-          <w:sz w:val="20"/>
-          <w:szCs w:val="20"/>
+          <w:sz w:val="22"/>
+          <w:szCs w:val="22"/>
         </w:rPr>
         <w:t xml:space="preserve">Found and reported crimes in the city with the news team.</w:t>
       </w:r>
@@ -438,18 +438,18 @@
         <w:rPr>
           <w:rFonts w:ascii="Cambria" w:cs="Cambria" w:eastAsia="Cambria" w:hAnsi="Cambria"/>
           <w:color w:val="111111"/>
-          <w:sz w:val="20"/>
-          <w:szCs w:val="20"/>
+          <w:sz w:val="22"/>
+          <w:szCs w:val="22"/>
         </w:rPr>
         <w:t xml:space="preserve">Finished all daily work on time while doing two full-time jobs.</w:t>
       </w:r>
     </w:p>
     <w:p>
       <w:pPr>
-        <w:tabs>
-          <w:tab w:val="right" w:pos="9746"/>
-        </w:tabs>
-        <w:spacing w:after="0" w:before="140"/>
+        <w:pBdr>
+          <w:bottom w:val="single" w:color="111111" w:sz="12" w:space="2"/>
+        </w:pBdr>
+        <w:spacing w:after="100" w:before="220"/>
       </w:pPr>
       <w:r>
         <w:rPr>
@@ -457,19 +457,39 @@
           <w:b/>
           <w:bCs/>
           <w:color w:val="111111"/>
-          <w:sz w:val="20"/>
-          <w:szCs w:val="20"/>
-        </w:rPr>
-        <w:t xml:space="preserve">Town Volunteer</w:t>
-      </w:r>
-      <w:r>
-        <w:rPr>
-          <w:rFonts w:ascii="Cambria" w:cs="Cambria" w:eastAsia="Cambria" w:hAnsi="Cambria"/>
-          <w:color w:val="111111"/>
-          <w:sz w:val="20"/>
-          <w:szCs w:val="20"/>
-        </w:rPr>
-        <w:t xml:space="preserve">	1930/06 – 1934/08</w:t>
+          <w:spacing w:val="10"/>
+          <w:sz w:val="25"/>
+          <w:szCs w:val="25"/>
+        </w:rPr>
+        <w:t xml:space="preserve">EDUCATION</w:t>
+      </w:r>
+    </w:p>
+    <w:p>
+      <w:pPr>
+        <w:tabs>
+          <w:tab w:val="right" w:pos="9746"/>
+        </w:tabs>
+        <w:spacing w:after="0" w:before="60"/>
+      </w:pPr>
+      <w:r>
+        <w:rPr>
+          <w:rFonts w:ascii="Cambria" w:cs="Cambria" w:eastAsia="Cambria" w:hAnsi="Cambria"/>
+          <w:b/>
+          <w:bCs/>
+          <w:color w:val="111111"/>
+          <w:sz w:val="22"/>
+          <w:szCs w:val="22"/>
+        </w:rPr>
+        <w:t xml:space="preserve">Degree in Media</w:t>
+      </w:r>
+      <w:r>
+        <w:rPr>
+          <w:rFonts w:ascii="Cambria" w:cs="Cambria" w:eastAsia="Cambria" w:hAnsi="Cambria"/>
+          <w:color w:val="111111"/>
+          <w:sz w:val="22"/>
+          <w:szCs w:val="22"/>
+        </w:rPr>
+        <w:t xml:space="preserve">	1934 – 1938</w:t>
       </w:r>
     </w:p>
     <w:p>
@@ -485,57 +505,19 @@
           <w:i/>
           <w:iCs/>
           <w:color w:val="333333"/>
-          <w:sz w:val="20"/>
-          <w:szCs w:val="20"/>
-        </w:rPr>
-        <w:t xml:space="preserve">Town Volunteers</w:t>
-      </w:r>
-      <w:r>
-        <w:rPr>
-          <w:rFonts w:ascii="Cambria" w:cs="Cambria" w:eastAsia="Cambria" w:hAnsi="Cambria"/>
-          <w:color w:val="111111"/>
-          <w:sz w:val="20"/>
-          <w:szCs w:val="20"/>
-        </w:rPr>
-        <w:t xml:space="preserve">	Smallville, USA</w:t>
-      </w:r>
-    </w:p>
-    <w:p>
-      <w:pPr>
-        <w:pStyle w:val="ListParagraph"/>
-        <w:numPr>
-          <w:ilvl w:val="0"/>
-          <w:numId w:val="2"/>
-        </w:numPr>
-        <w:spacing w:after="10"/>
-      </w:pPr>
-      <w:r>
-        <w:rPr>
-          <w:rFonts w:ascii="Cambria" w:cs="Cambria" w:eastAsia="Cambria" w:hAnsi="Cambria"/>
-          <w:color w:val="111111"/>
-          <w:sz w:val="20"/>
-          <w:szCs w:val="20"/>
-        </w:rPr>
-        <w:t xml:space="preserve">Helped 100+ families during floods, fires and storms.</w:t>
-      </w:r>
-    </w:p>
-    <w:p>
-      <w:pPr>
-        <w:pStyle w:val="ListParagraph"/>
-        <w:numPr>
-          <w:ilvl w:val="0"/>
-          <w:numId w:val="2"/>
-        </w:numPr>
-        <w:spacing w:after="10"/>
-      </w:pPr>
-      <w:r>
-        <w:rPr>
-          <w:rFonts w:ascii="Cambria" w:cs="Cambria" w:eastAsia="Cambria" w:hAnsi="Cambria"/>
-          <w:color w:val="111111"/>
-          <w:sz w:val="20"/>
-          <w:szCs w:val="20"/>
-        </w:rPr>
-        <w:t xml:space="preserve">Helped local farms with harvest work and repairs.</w:t>
+          <w:sz w:val="22"/>
+          <w:szCs w:val="22"/>
+        </w:rPr>
+        <w:t xml:space="preserve">Sky University</w:t>
+      </w:r>
+      <w:r>
+        <w:rPr>
+          <w:rFonts w:ascii="Cambria" w:cs="Cambria" w:eastAsia="Cambria" w:hAnsi="Cambria"/>
+          <w:color w:val="111111"/>
+          <w:sz w:val="22"/>
+          <w:szCs w:val="22"/>
+        </w:rPr>
+        <w:t xml:space="preserve">	Metropolis, USA</w:t>
       </w:r>
     </w:p>
     <w:p>
@@ -543,83 +525,7 @@
         <w:pBdr>
           <w:bottom w:val="single" w:color="111111" w:sz="12" w:space="2"/>
         </w:pBdr>
-        <w:spacing w:after="80" w:before="180"/>
-      </w:pPr>
-      <w:r>
-        <w:rPr>
-          <w:rFonts w:ascii="Cambria" w:cs="Cambria" w:eastAsia="Cambria" w:hAnsi="Cambria"/>
-          <w:b/>
-          <w:bCs/>
-          <w:color w:val="111111"/>
-          <w:spacing w:val="10"/>
-          <w:sz w:val="25"/>
-          <w:szCs w:val="25"/>
-        </w:rPr>
-        <w:t xml:space="preserve">EDUCATION</w:t>
-      </w:r>
-    </w:p>
-    <w:p>
-      <w:pPr>
-        <w:tabs>
-          <w:tab w:val="right" w:pos="9746"/>
-        </w:tabs>
-        <w:spacing w:after="0" w:before="60"/>
-      </w:pPr>
-      <w:r>
-        <w:rPr>
-          <w:rFonts w:ascii="Cambria" w:cs="Cambria" w:eastAsia="Cambria" w:hAnsi="Cambria"/>
-          <w:b/>
-          <w:bCs/>
-          <w:color w:val="111111"/>
-          <w:sz w:val="20"/>
-          <w:szCs w:val="20"/>
-        </w:rPr>
-        <w:t xml:space="preserve">Degree in Media</w:t>
-      </w:r>
-      <w:r>
-        <w:rPr>
-          <w:rFonts w:ascii="Cambria" w:cs="Cambria" w:eastAsia="Cambria" w:hAnsi="Cambria"/>
-          <w:color w:val="111111"/>
-          <w:sz w:val="20"/>
-          <w:szCs w:val="20"/>
-        </w:rPr>
-        <w:t xml:space="preserve">	1934 – 1938</w:t>
-      </w:r>
-    </w:p>
-    <w:p>
-      <w:pPr>
-        <w:tabs>
-          <w:tab w:val="right" w:pos="9746"/>
-        </w:tabs>
-        <w:spacing w:after="30"/>
-      </w:pPr>
-      <w:r>
-        <w:rPr>
-          <w:rFonts w:ascii="Cambria" w:cs="Cambria" w:eastAsia="Cambria" w:hAnsi="Cambria"/>
-          <w:i/>
-          <w:iCs/>
-          <w:color w:val="333333"/>
-          <w:sz w:val="20"/>
-          <w:szCs w:val="20"/>
-        </w:rPr>
-        <w:t xml:space="preserve">Sky University</w:t>
-      </w:r>
-      <w:r>
-        <w:rPr>
-          <w:rFonts w:ascii="Cambria" w:cs="Cambria" w:eastAsia="Cambria" w:hAnsi="Cambria"/>
-          <w:color w:val="111111"/>
-          <w:sz w:val="20"/>
-          <w:szCs w:val="20"/>
-        </w:rPr>
-        <w:t xml:space="preserve">	Metropolis, USA</w:t>
-      </w:r>
-    </w:p>
-    <w:p>
-      <w:pPr>
-        <w:pBdr>
-          <w:bottom w:val="single" w:color="111111" w:sz="12" w:space="2"/>
-        </w:pBdr>
-        <w:spacing w:after="80" w:before="180"/>
+        <w:spacing w:after="100" w:before="220"/>
       </w:pPr>
       <w:r>
         <w:rPr>
@@ -657,14 +563,14 @@
         <w:tabs>
           <w:tab w:val="left" w:pos="4873"/>
         </w:tabs>
-        <w:spacing w:after="30"/>
-      </w:pPr>
-      <w:r>
-        <w:rPr>
-          <w:rFonts w:ascii="Cambria" w:cs="Cambria" w:eastAsia="Cambria" w:hAnsi="Cambria"/>
-          <w:color w:val="111111"/>
-          <w:sz w:val="20"/>
-          <w:szCs w:val="20"/>
+        <w:spacing w:after="50"/>
+      </w:pPr>
+      <w:r>
+        <w:rPr>
+          <w:rFonts w:ascii="Cambria" w:cs="Cambria" w:eastAsia="Cambria" w:hAnsi="Cambria"/>
+          <w:color w:val="111111"/>
+          <w:sz w:val="22"/>
+          <w:szCs w:val="22"/>
         </w:rPr>
         <w:t xml:space="preserve">•  Saving People</w:t>
       </w:r>
@@ -672,8 +578,8 @@
         <w:rPr>
           <w:rFonts w:ascii="Cambria" w:cs="Cambria" w:eastAsia="Cambria" w:hAnsi="Cambria"/>
           <w:color w:val="111111"/>
-          <w:sz w:val="20"/>
-          <w:szCs w:val="20"/>
+          <w:sz w:val="22"/>
+          <w:szCs w:val="22"/>
         </w:rPr>
         <w:t xml:space="preserve">	•  First Aid</w:t>
       </w:r>
@@ -683,14 +589,14 @@
         <w:tabs>
           <w:tab w:val="left" w:pos="4873"/>
         </w:tabs>
-        <w:spacing w:after="30"/>
-      </w:pPr>
-      <w:r>
-        <w:rPr>
-          <w:rFonts w:ascii="Cambria" w:cs="Cambria" w:eastAsia="Cambria" w:hAnsi="Cambria"/>
-          <w:color w:val="111111"/>
-          <w:sz w:val="20"/>
-          <w:szCs w:val="20"/>
+        <w:spacing w:after="50"/>
+      </w:pPr>
+      <w:r>
+        <w:rPr>
+          <w:rFonts w:ascii="Cambria" w:cs="Cambria" w:eastAsia="Cambria" w:hAnsi="Cambria"/>
+          <w:color w:val="111111"/>
+          <w:sz w:val="22"/>
+          <w:szCs w:val="22"/>
         </w:rPr>
         <w:t xml:space="preserve">•  Research</w:t>
       </w:r>
@@ -698,8 +604,8 @@
         <w:rPr>
           <w:rFonts w:ascii="Cambria" w:cs="Cambria" w:eastAsia="Cambria" w:hAnsi="Cambria"/>
           <w:color w:val="111111"/>
-          <w:sz w:val="20"/>
-          <w:szCs w:val="20"/>
+          <w:sz w:val="22"/>
+          <w:szCs w:val="22"/>
         </w:rPr>
         <w:t xml:space="preserve">	•  Writing and Editing</w:t>
       </w:r>
@@ -709,14 +615,14 @@
         <w:tabs>
           <w:tab w:val="left" w:pos="4873"/>
         </w:tabs>
-        <w:spacing w:after="30"/>
-      </w:pPr>
-      <w:r>
-        <w:rPr>
-          <w:rFonts w:ascii="Cambria" w:cs="Cambria" w:eastAsia="Cambria" w:hAnsi="Cambria"/>
-          <w:color w:val="111111"/>
-          <w:sz w:val="20"/>
-          <w:szCs w:val="20"/>
+        <w:spacing w:after="50"/>
+      </w:pPr>
+      <w:r>
+        <w:rPr>
+          <w:rFonts w:ascii="Cambria" w:cs="Cambria" w:eastAsia="Cambria" w:hAnsi="Cambria"/>
+          <w:color w:val="111111"/>
+          <w:sz w:val="22"/>
+          <w:szCs w:val="22"/>
         </w:rPr>
         <w:t xml:space="preserve">•  Safety Planning</w:t>
       </w:r>
@@ -724,8 +630,8 @@
         <w:rPr>
           <w:rFonts w:ascii="Cambria" w:cs="Cambria" w:eastAsia="Cambria" w:hAnsi="Cambria"/>
           <w:color w:val="111111"/>
-          <w:sz w:val="20"/>
-          <w:szCs w:val="20"/>
+          <w:sz w:val="22"/>
+          <w:szCs w:val="22"/>
         </w:rPr>
         <w:t xml:space="preserve">	•  Flying and Super Strength</w:t>
       </w:r>
@@ -753,14 +659,14 @@
         <w:tabs>
           <w:tab w:val="left" w:pos="4873"/>
         </w:tabs>
-        <w:spacing w:after="30"/>
-      </w:pPr>
-      <w:r>
-        <w:rPr>
-          <w:rFonts w:ascii="Cambria" w:cs="Cambria" w:eastAsia="Cambria" w:hAnsi="Cambria"/>
-          <w:color w:val="111111"/>
-          <w:sz w:val="20"/>
-          <w:szCs w:val="20"/>
+        <w:spacing w:after="50"/>
+      </w:pPr>
+      <w:r>
+        <w:rPr>
+          <w:rFonts w:ascii="Cambria" w:cs="Cambria" w:eastAsia="Cambria" w:hAnsi="Cambria"/>
+          <w:color w:val="111111"/>
+          <w:sz w:val="22"/>
+          <w:szCs w:val="22"/>
         </w:rPr>
         <w:t xml:space="preserve">•  Communication</w:t>
       </w:r>
@@ -768,8 +674,8 @@
         <w:rPr>
           <w:rFonts w:ascii="Cambria" w:cs="Cambria" w:eastAsia="Cambria" w:hAnsi="Cambria"/>
           <w:color w:val="111111"/>
-          <w:sz w:val="20"/>
-          <w:szCs w:val="20"/>
+          <w:sz w:val="22"/>
+          <w:szCs w:val="22"/>
         </w:rPr>
         <w:t xml:space="preserve">	•  Leadership</w:t>
       </w:r>
@@ -779,14 +685,14 @@
         <w:tabs>
           <w:tab w:val="left" w:pos="4873"/>
         </w:tabs>
-        <w:spacing w:after="30"/>
-      </w:pPr>
-      <w:r>
-        <w:rPr>
-          <w:rFonts w:ascii="Cambria" w:cs="Cambria" w:eastAsia="Cambria" w:hAnsi="Cambria"/>
-          <w:color w:val="111111"/>
-          <w:sz w:val="20"/>
-          <w:szCs w:val="20"/>
+        <w:spacing w:after="50"/>
+      </w:pPr>
+      <w:r>
+        <w:rPr>
+          <w:rFonts w:ascii="Cambria" w:cs="Cambria" w:eastAsia="Cambria" w:hAnsi="Cambria"/>
+          <w:color w:val="111111"/>
+          <w:sz w:val="22"/>
+          <w:szCs w:val="22"/>
         </w:rPr>
         <w:t xml:space="preserve">•  Teamwork</w:t>
       </w:r>
@@ -794,8 +700,8 @@
         <w:rPr>
           <w:rFonts w:ascii="Cambria" w:cs="Cambria" w:eastAsia="Cambria" w:hAnsi="Cambria"/>
           <w:color w:val="111111"/>
-          <w:sz w:val="20"/>
-          <w:szCs w:val="20"/>
+          <w:sz w:val="22"/>
+          <w:szCs w:val="22"/>
         </w:rPr>
         <w:t xml:space="preserve">	•  Problem-Solving</w:t>
       </w:r>
@@ -805,14 +711,14 @@
         <w:tabs>
           <w:tab w:val="left" w:pos="4873"/>
         </w:tabs>
-        <w:spacing w:after="30"/>
-      </w:pPr>
-      <w:r>
-        <w:rPr>
-          <w:rFonts w:ascii="Cambria" w:cs="Cambria" w:eastAsia="Cambria" w:hAnsi="Cambria"/>
-          <w:color w:val="111111"/>
-          <w:sz w:val="20"/>
-          <w:szCs w:val="20"/>
+        <w:spacing w:after="50"/>
+      </w:pPr>
+      <w:r>
+        <w:rPr>
+          <w:rFonts w:ascii="Cambria" w:cs="Cambria" w:eastAsia="Cambria" w:hAnsi="Cambria"/>
+          <w:color w:val="111111"/>
+          <w:sz w:val="22"/>
+          <w:szCs w:val="22"/>
         </w:rPr>
         <w:t xml:space="preserve">•  Fast Decisions</w:t>
       </w:r>
@@ -820,8 +726,8 @@
         <w:rPr>
           <w:rFonts w:ascii="Cambria" w:cs="Cambria" w:eastAsia="Cambria" w:hAnsi="Cambria"/>
           <w:color w:val="111111"/>
-          <w:sz w:val="20"/>
-          <w:szCs w:val="20"/>
+          <w:sz w:val="22"/>
+          <w:szCs w:val="22"/>
         </w:rPr>
         <w:t xml:space="preserve">	•  Time Management</w:t>
       </w:r>
@@ -831,7 +737,7 @@
         <w:pBdr>
           <w:bottom w:val="single" w:color="111111" w:sz="12" w:space="2"/>
         </w:pBdr>
-        <w:spacing w:after="80" w:before="180"/>
+        <w:spacing w:after="100" w:before="220"/>
       </w:pPr>
       <w:r>
         <w:rPr>
@@ -851,14 +757,14 @@
         <w:tabs>
           <w:tab w:val="left" w:pos="4873"/>
         </w:tabs>
-        <w:spacing w:after="30"/>
-      </w:pPr>
-      <w:r>
-        <w:rPr>
-          <w:rFonts w:ascii="Cambria" w:cs="Cambria" w:eastAsia="Cambria" w:hAnsi="Cambria"/>
-          <w:color w:val="111111"/>
-          <w:sz w:val="20"/>
-          <w:szCs w:val="20"/>
+        <w:spacing w:after="50"/>
+      </w:pPr>
+      <w:r>
+        <w:rPr>
+          <w:rFonts w:ascii="Cambria" w:cs="Cambria" w:eastAsia="Cambria" w:hAnsi="Cambria"/>
+          <w:color w:val="111111"/>
+          <w:sz w:val="22"/>
+          <w:szCs w:val="22"/>
         </w:rPr>
         <w:t xml:space="preserve">•  First Aid (1939)</w:t>
       </w:r>
@@ -866,8 +772,8 @@
         <w:rPr>
           <w:rFonts w:ascii="Cambria" w:cs="Cambria" w:eastAsia="Cambria" w:hAnsi="Cambria"/>
           <w:color w:val="111111"/>
-          <w:sz w:val="20"/>
-          <w:szCs w:val="20"/>
+          <w:sz w:val="22"/>
+          <w:szCs w:val="22"/>
         </w:rPr>
         <w:t xml:space="preserve">	•  Safe Flying (1940)</w:t>
       </w:r>
@@ -877,14 +783,14 @@
         <w:tabs>
           <w:tab w:val="left" w:pos="4873"/>
         </w:tabs>
-        <w:spacing w:after="30"/>
-      </w:pPr>
-      <w:r>
-        <w:rPr>
-          <w:rFonts w:ascii="Cambria" w:cs="Cambria" w:eastAsia="Cambria" w:hAnsi="Cambria"/>
-          <w:color w:val="111111"/>
-          <w:sz w:val="20"/>
-          <w:szCs w:val="20"/>
+        <w:spacing w:after="50"/>
+      </w:pPr>
+      <w:r>
+        <w:rPr>
+          <w:rFonts w:ascii="Cambria" w:cs="Cambria" w:eastAsia="Cambria" w:hAnsi="Cambria"/>
+          <w:color w:val="111111"/>
+          <w:sz w:val="22"/>
+          <w:szCs w:val="22"/>
         </w:rPr>
         <w:t xml:space="preserve">•  Team Leadership Course (1961)</w:t>
       </w:r>
@@ -892,8 +798,8 @@
         <w:rPr>
           <w:rFonts w:ascii="Cambria" w:cs="Cambria" w:eastAsia="Cambria" w:hAnsi="Cambria"/>
           <w:color w:val="111111"/>
-          <w:sz w:val="20"/>
-          <w:szCs w:val="20"/>
+          <w:sz w:val="22"/>
+          <w:szCs w:val="22"/>
         </w:rPr>
         <w:t xml:space="preserve">	•  Key to the City (Award)</w:t>
       </w:r>
@@ -903,7 +809,7 @@
         <w:pBdr>
           <w:bottom w:val="single" w:color="111111" w:sz="12" w:space="2"/>
         </w:pBdr>
-        <w:spacing w:after="80" w:before="180"/>
+        <w:spacing w:after="100" w:before="220"/>
       </w:pPr>
       <w:r>
         <w:rPr>
@@ -923,14 +829,14 @@
         <w:tabs>
           <w:tab w:val="left" w:pos="4873"/>
         </w:tabs>
-        <w:spacing w:after="30"/>
-      </w:pPr>
-      <w:r>
-        <w:rPr>
-          <w:rFonts w:ascii="Cambria" w:cs="Cambria" w:eastAsia="Cambria" w:hAnsi="Cambria"/>
-          <w:color w:val="111111"/>
-          <w:sz w:val="20"/>
-          <w:szCs w:val="20"/>
+        <w:spacing w:after="50"/>
+      </w:pPr>
+      <w:r>
+        <w:rPr>
+          <w:rFonts w:ascii="Cambria" w:cs="Cambria" w:eastAsia="Cambria" w:hAnsi="Cambria"/>
+          <w:color w:val="111111"/>
+          <w:sz w:val="22"/>
+          <w:szCs w:val="22"/>
         </w:rPr>
         <w:t xml:space="preserve">•  English (Native)</w:t>
       </w:r>
@@ -938,8 +844,8 @@
         <w:rPr>
           <w:rFonts w:ascii="Cambria" w:cs="Cambria" w:eastAsia="Cambria" w:hAnsi="Cambria"/>
           <w:color w:val="111111"/>
-          <w:sz w:val="20"/>
-          <w:szCs w:val="20"/>
+          <w:sz w:val="22"/>
+          <w:szCs w:val="22"/>
         </w:rPr>
         <w:t xml:space="preserve">	•  French (Good)</w:t>
       </w:r>

</xml_diff>

<commit_message>
Improve cover letter and add team names to CV and letter
Co-Authored-By: Claude Opus 5.5 <noreply@anthropic.com>
Claude-Session: https://claude.ai/code/session_01FBuHsgfNN7NePtiYw7LpVx
</commit_message>
<xml_diff>
--- a/Superman_CV.docx
+++ b/Superman_CV.docx
@@ -851,6 +851,7 @@
       </w:r>
     </w:p>
     <w:sectPr>
+      <w:footerReference w:type="default" r:id="rId7"/>
       <w:pgSz w:w="11906" w:h="16838" w:orient="portrait"/>
       <w:pgMar w:top="800" w:right="1080" w:bottom="700" w:left="1080" w:header="708" w:footer="708" w:gutter="0"/>
       <w:pgNumType/>
@@ -899,6 +900,39 @@
     </w:p>
   </w:endnote>
 </w:endnotes>
+</file>
+
+<file path=word/footer1.xml><?xml version="1.0" encoding="utf-8"?>
+<w:ftr xmlns:wpc="http://schemas.microsoft.com/office/word/2010/wordprocessingCanvas" xmlns:mc="http://schemas.openxmlformats.org/markup-compatibility/2006" xmlns:o="urn:schemas-microsoft-com:office:office" xmlns:r="http://schemas.openxmlformats.org/officeDocument/2006/relationships" xmlns:m="http://schemas.openxmlformats.org/officeDocument/2006/math" xmlns:v="urn:schemas-microsoft-com:vml" xmlns:wp14="http://schemas.microsoft.com/office/word/2010/wordprocessingDrawing" xmlns:wp="http://schemas.openxmlformats.org/drawingml/2006/wordprocessingDrawing" xmlns:w10="urn:schemas-microsoft-com:office:word" xmlns:w="http://schemas.openxmlformats.org/wordprocessingml/2006/main" xmlns:w14="http://schemas.microsoft.com/office/word/2010/wordml" xmlns:w15="http://schemas.microsoft.com/office/word/2012/wordml" xmlns:wpg="http://schemas.microsoft.com/office/word/2010/wordprocessingGroup" xmlns:wpi="http://schemas.microsoft.com/office/word/2010/wordprocessingInk" xmlns:wne="http://schemas.microsoft.com/office/word/2006/wordml" xmlns:wps="http://schemas.microsoft.com/office/word/2010/wordprocessingShape">
+  <w:p>
+    <w:pPr>
+      <w:pBdr>
+        <w:top w:val="single" w:color="999999" w:sz="4" w:space="6"/>
+      </w:pBdr>
+      <w:jc w:val="center"/>
+    </w:pPr>
+    <w:r>
+      <w:rPr>
+        <w:rFonts w:ascii="Cambria" w:cs="Cambria" w:eastAsia="Cambria" w:hAnsi="Cambria"/>
+        <w:b/>
+        <w:bCs/>
+        <w:color w:val="555555"/>
+        <w:sz w:val="19"/>
+        <w:szCs w:val="19"/>
+      </w:rPr>
+      <w:t xml:space="preserve">Prepared by: </w:t>
+    </w:r>
+    <w:r>
+      <w:rPr>
+        <w:rFonts w:ascii="Cambria" w:cs="Cambria" w:eastAsia="Cambria" w:hAnsi="Cambria"/>
+        <w:color w:val="555555"/>
+        <w:sz w:val="19"/>
+        <w:szCs w:val="19"/>
+      </w:rPr>
+      <w:t xml:space="preserve">Rahma Khaled  •  Aya Reda  •  Mahmoud Ibrahim  •  Abader Zarif</w:t>
+    </w:r>
+  </w:p>
+</w:ftr>
 </file>
 
 <file path=word/footnotes.xml><?xml version="1.0" encoding="utf-8"?>

</xml_diff>